<commit_message>
Replaced IEEE SRS document
</commit_message>
<xml_diff>
--- a/docs/CSC325_Group02_IEEE_SRS.docx
+++ b/docs/CSC325_Group02_IEEE_SRS.docx
@@ -72,7 +72,21 @@
           <w:sz w:val="24"/>
           <w:szCs w:val="24"/>
         </w:rPr>
-        <w:t>CSC 325 Software Engineering – Group 02</w:t>
+        <w:t xml:space="preserve">CSC 325 Software Engineering </w:t>
+      </w:r>
+      <w:r>
+        <w:rPr>
+          <w:sz w:val="24"/>
+          <w:szCs w:val="24"/>
+        </w:rPr>
+        <w:t>-</w:t>
+      </w:r>
+      <w:r>
+        <w:rPr>
+          <w:sz w:val="24"/>
+          <w:szCs w:val="24"/>
+        </w:rPr>
+        <w:t xml:space="preserve"> Group 02</w:t>
       </w:r>
     </w:p>
     <w:p>
@@ -125,7 +139,13 @@
         <w:jc w:val="center"/>
       </w:pPr>
       <w:r>
-        <w:t>Jake Pepitone – Project Manager</w:t>
+        <w:t xml:space="preserve">Jake Pepitone </w:t>
+      </w:r>
+      <w:r>
+        <w:t>-</w:t>
+      </w:r>
+      <w:r>
+        <w:t xml:space="preserve"> Project Manager</w:t>
       </w:r>
     </w:p>
     <w:p>
@@ -133,7 +153,13 @@
         <w:jc w:val="center"/>
       </w:pPr>
       <w:r>
-        <w:t>Mohammed – Backend Engineer</w:t>
+        <w:t xml:space="preserve">Mohammed </w:t>
+      </w:r>
+      <w:r>
+        <w:t>-</w:t>
+      </w:r>
+      <w:r>
+        <w:t xml:space="preserve"> Backend Engineer</w:t>
       </w:r>
     </w:p>
     <w:p>
@@ -141,7 +167,13 @@
         <w:jc w:val="center"/>
       </w:pPr>
       <w:r>
-        <w:t>Ramon – Database Engineer</w:t>
+        <w:t xml:space="preserve">Ramon </w:t>
+      </w:r>
+      <w:r>
+        <w:t>-</w:t>
+      </w:r>
+      <w:r>
+        <w:t xml:space="preserve"> Database Engineer</w:t>
       </w:r>
     </w:p>
     <w:p>
@@ -149,7 +181,13 @@
         <w:jc w:val="center"/>
       </w:pPr>
       <w:r>
-        <w:t>Kundan – Frontend Engineer</w:t>
+        <w:t xml:space="preserve">Kundan </w:t>
+      </w:r>
+      <w:r>
+        <w:t>-</w:t>
+      </w:r>
+      <w:r>
+        <w:t xml:space="preserve"> Frontend Engineer</w:t>
       </w:r>
     </w:p>
     <w:p>
@@ -157,7 +195,13 @@
         <w:jc w:val="center"/>
       </w:pPr>
       <w:r>
-        <w:t>Gabriel – QA / UAT Teste</w:t>
+        <w:t xml:space="preserve">Gabriel </w:t>
+      </w:r>
+      <w:r>
+        <w:t>-</w:t>
+      </w:r>
+      <w:r>
+        <w:t xml:space="preserve"> QA / UAT Teste</w:t>
       </w:r>
     </w:p>
     <w:p>
@@ -194,12 +238,6 @@
         <w:gridCol w:w="1300"/>
       </w:tblGrid>
       <w:tr>
-        <w:tblPrEx>
-          <w:tblCellMar>
-            <w:top w:w="0" w:type="dxa"/>
-            <w:bottom w:w="0" w:type="dxa"/>
-          </w:tblCellMar>
-        </w:tblPrEx>
         <w:trPr>
           <w:tblHeader/>
         </w:trPr>
@@ -321,12 +359,6 @@
         </w:tc>
       </w:tr>
       <w:tr>
-        <w:tblPrEx>
-          <w:tblCellMar>
-            <w:top w:w="0" w:type="dxa"/>
-            <w:bottom w:w="0" w:type="dxa"/>
-          </w:tblCellMar>
-        </w:tblPrEx>
         <w:trPr>
           <w:trHeight w:val="611"/>
         </w:trPr>
@@ -428,12 +460,6 @@
         </w:tc>
       </w:tr>
       <w:tr>
-        <w:tblPrEx>
-          <w:tblCellMar>
-            <w:top w:w="0" w:type="dxa"/>
-            <w:bottom w:w="0" w:type="dxa"/>
-          </w:tblCellMar>
-        </w:tblPrEx>
         <w:trPr>
           <w:trHeight w:val="1277"/>
         </w:trPr>
@@ -561,7 +587,13 @@
     </w:p>
     <w:p>
       <w:r>
-        <w:t>This Software Requirements Specification (SRS) defines the functional and nonfunctional requirements for Version 1.0 of the Accounting AI Financial Assistant, developed by Group 02 for CSC 325 – Software Engineering at Farmingdale State College. This document covers the complete desktop application as proposed in the team’s initial project proposal, including document upload, AI-based financial document analysis, result storage, and dashboard reporting. This SRS describes the entire system; no subsystems are out of scope.</w:t>
+        <w:t xml:space="preserve">This Software Requirements Specification (SRS) defines the functional and nonfunctional requirements for Version 1.0 of the Accounting AI Financial Assistant, developed by Group 02 for CSC 325 </w:t>
+      </w:r>
+      <w:r>
+        <w:t xml:space="preserve">- </w:t>
+      </w:r>
+      <w:r>
+        <w:t>Software Engineering at Farmingdale State College. This document covers the complete desktop application as proposed in the team’s initial project proposal, including document upload, AI-based financial document analysis, result storage, and dashboard reporting. This SRS describes the entire system; no subsystems are out of scope.</w:t>
       </w:r>
     </w:p>
     <w:p>
@@ -748,7 +780,19 @@
         </w:numPr>
       </w:pPr>
       <w:r>
-        <w:t>CSC 325 Project Proposal – Accounting AI Financial Assistant, Group 02, Jake Pepitone et al., Summer 2026 (initial proposal submission).</w:t>
+        <w:t xml:space="preserve">CSC 325 Project Proposal </w:t>
+      </w:r>
+      <w:r>
+        <w:t xml:space="preserve">- </w:t>
+      </w:r>
+      <w:r>
+        <w:t>Accounting AI Financial Assistant, Group 02, Jake Pepitone</w:t>
+      </w:r>
+      <w:r>
+        <w:t xml:space="preserve">, </w:t>
+      </w:r>
+      <w:r>
+        <w:t>Summer 2026 (initial proposal submission).</w:t>
       </w:r>
     </w:p>
     <w:p>
@@ -781,44 +825,82 @@
       </w:r>
       <w:proofErr w:type="spellEnd"/>
       <w:r>
-        <w:t xml:space="preserve"> Documentation, https://pdfbox.apache.org/</w:t>
-      </w:r>
-    </w:p>
-    <w:p>
-      <w:pPr>
-        <w:pStyle w:val="ListParagraph"/>
-        <w:numPr>
-          <w:ilvl w:val="0"/>
-          <w:numId w:val="2"/>
-        </w:numPr>
-      </w:pPr>
-      <w:r>
-        <w:t>OpenAI API Reference, https://platform.openai.com/docs</w:t>
-      </w:r>
-    </w:p>
-    <w:p>
-      <w:pPr>
-        <w:pStyle w:val="ListParagraph"/>
-        <w:numPr>
-          <w:ilvl w:val="0"/>
-          <w:numId w:val="2"/>
-        </w:numPr>
-      </w:pPr>
-      <w:r>
-        <w:t>Google Gemini API Documentation, https://ai.google.dev/</w:t>
-      </w:r>
-    </w:p>
-    <w:p>
-      <w:pPr>
-        <w:pStyle w:val="ListParagraph"/>
-        <w:numPr>
-          <w:ilvl w:val="0"/>
-          <w:numId w:val="2"/>
-        </w:numPr>
-      </w:pPr>
-      <w:r>
-        <w:t>JavaFX Documentation, https://openjfx.io/</w:t>
-      </w:r>
+        <w:t xml:space="preserve"> Documentation, </w:t>
+      </w:r>
+      <w:hyperlink r:id="rId7" w:history="1">
+        <w:r>
+          <w:rPr>
+            <w:rStyle w:val="Hyperlink"/>
+          </w:rPr>
+          <w:t>https://pdfbox.apache.org/</w:t>
+        </w:r>
+      </w:hyperlink>
+    </w:p>
+    <w:p>
+      <w:pPr>
+        <w:pStyle w:val="ListParagraph"/>
+        <w:numPr>
+          <w:ilvl w:val="0"/>
+          <w:numId w:val="2"/>
+        </w:numPr>
+      </w:pPr>
+      <w:r>
+        <w:t xml:space="preserve">OpenAI API Reference, </w:t>
+      </w:r>
+      <w:hyperlink r:id="rId8" w:history="1">
+        <w:r>
+          <w:rPr>
+            <w:rStyle w:val="Hyperlink"/>
+          </w:rPr>
+          <w:t>https://platform.openai.com/docs</w:t>
+        </w:r>
+      </w:hyperlink>
+    </w:p>
+    <w:p>
+      <w:pPr>
+        <w:pStyle w:val="ListParagraph"/>
+        <w:numPr>
+          <w:ilvl w:val="0"/>
+          <w:numId w:val="2"/>
+        </w:numPr>
+      </w:pPr>
+      <w:r>
+        <w:t xml:space="preserve">Google Gemini API Documentation, </w:t>
+      </w:r>
+      <w:hyperlink r:id="rId9" w:history="1">
+        <w:r>
+          <w:rPr>
+            <w:rStyle w:val="Hyperlink"/>
+          </w:rPr>
+          <w:t>https://ai.google.dev/</w:t>
+        </w:r>
+      </w:hyperlink>
+    </w:p>
+    <w:p>
+      <w:pPr>
+        <w:pStyle w:val="ListParagraph"/>
+        <w:numPr>
+          <w:ilvl w:val="0"/>
+          <w:numId w:val="2"/>
+        </w:numPr>
+      </w:pPr>
+      <w:r>
+        <w:t xml:space="preserve">JavaFX Documentation, </w:t>
+      </w:r>
+      <w:hyperlink r:id="rId10" w:history="1">
+        <w:r>
+          <w:rPr>
+            <w:rStyle w:val="Hyperlink"/>
+          </w:rPr>
+          <w:t>https://openjfx.io/</w:t>
+        </w:r>
+      </w:hyperlink>
+    </w:p>
+    <w:p>
+      <w:pPr>
+        <w:pStyle w:val="ListParagraph"/>
+        <w:ind w:left="720"/>
+      </w:pPr>
     </w:p>
     <w:p/>
     <w:p>
@@ -1105,7 +1187,13 @@
         </w:numPr>
       </w:pPr>
       <w:r>
-        <w:t xml:space="preserve">Administrator (future) – would manage application configuration such as API </w:t>
+        <w:t xml:space="preserve">Administrator (future) </w:t>
+      </w:r>
+      <w:r>
+        <w:t>-</w:t>
+      </w:r>
+      <w:r>
+        <w:t xml:space="preserve"> would manage application configuration such as API </w:t>
       </w:r>
       <w:proofErr w:type="gramStart"/>
       <w:r>
@@ -1128,118 +1216,313 @@
         <w:spacing w:before="0" w:after="0"/>
       </w:pPr>
       <w:r>
+        <w:t>2.4 Operating Environment</w:t>
+      </w:r>
+    </w:p>
+    <w:p>
+      <w:r>
+        <w:t>The application shall operate as a standalone desktop program on the following operating systems:</w:t>
+      </w:r>
+    </w:p>
+    <w:p>
+      <w:pPr>
+        <w:pStyle w:val="ListParagraph"/>
+        <w:numPr>
+          <w:ilvl w:val="0"/>
+          <w:numId w:val="2"/>
+        </w:numPr>
+      </w:pPr>
+      <w:r>
+        <w:t>Windows 10 or later</w:t>
+      </w:r>
+    </w:p>
+    <w:p>
+      <w:pPr>
+        <w:pStyle w:val="ListParagraph"/>
+        <w:numPr>
+          <w:ilvl w:val="0"/>
+          <w:numId w:val="2"/>
+        </w:numPr>
+      </w:pPr>
+      <w:r>
+        <w:t>macOS 12 or later</w:t>
+      </w:r>
+    </w:p>
+    <w:p>
+      <w:pPr>
+        <w:pStyle w:val="ListParagraph"/>
+        <w:numPr>
+          <w:ilvl w:val="0"/>
+          <w:numId w:val="2"/>
+        </w:numPr>
+      </w:pPr>
+      <w:r>
+        <w:t>Linux distributions with a supported JavaFX runtime (Ubuntu 20.04 or later)</w:t>
+      </w:r>
+    </w:p>
+    <w:p>
+      <w:pPr>
+        <w:pStyle w:val="ListParagraph"/>
+        <w:ind w:left="720"/>
+      </w:pPr>
+    </w:p>
+    <w:p>
+      <w:r>
+        <w:t>The application requires a Java Runtime Environment compatible with JavaFX (Java 17 or later recommended), a local SQLite database file stored on the host filesystem, and an active internet connection for AI API calls (Section 3.3). No specific minimum hardware beyond what is required to run a modern JVM and JavaFX UI is assumed.</w:t>
+      </w:r>
+    </w:p>
+    <w:p/>
+    <w:p>
+      <w:pPr>
+        <w:pStyle w:val="Heading2"/>
+        <w:spacing w:before="0" w:after="0"/>
+      </w:pPr>
+      <w:r>
+        <w:t>2.5 Design and Implementation Constraints</w:t>
+      </w:r>
+    </w:p>
+    <w:p>
+      <w:pPr>
+        <w:pStyle w:val="ListParagraph"/>
+        <w:numPr>
+          <w:ilvl w:val="0"/>
+          <w:numId w:val="2"/>
+        </w:numPr>
+      </w:pPr>
+      <w:r>
+        <w:t>The application must be developed using Java, with JavaFX for the graphical user interface, per course requirements.</w:t>
+      </w:r>
+    </w:p>
+    <w:p>
+      <w:pPr>
+        <w:pStyle w:val="ListParagraph"/>
+        <w:numPr>
+          <w:ilvl w:val="0"/>
+          <w:numId w:val="2"/>
+        </w:numPr>
+      </w:pPr>
+      <w:r>
+        <w:t>The project must be completed within the CSC 325 course timeline (Summer 2026 term), including a mid-point presentation and final submission.</w:t>
+      </w:r>
+    </w:p>
+    <w:p>
+      <w:pPr>
+        <w:pStyle w:val="ListParagraph"/>
+        <w:numPr>
+          <w:ilvl w:val="0"/>
+          <w:numId w:val="2"/>
+        </w:numPr>
+      </w:pPr>
+      <w:r>
+        <w:t>AI functionality is dependent on third-party external APIs (OpenAI API and/or Google Gemini API); the system has no control over their availability, rate limits, or pricing changes.</w:t>
+      </w:r>
+    </w:p>
+    <w:p>
+      <w:pPr>
+        <w:pStyle w:val="ListParagraph"/>
+        <w:numPr>
+          <w:ilvl w:val="0"/>
+          <w:numId w:val="2"/>
+        </w:numPr>
+      </w:pPr>
+      <w:r>
+        <w:t xml:space="preserve">PDF text extraction is performed using Apache </w:t>
+      </w:r>
+      <w:proofErr w:type="spellStart"/>
+      <w:r>
+        <w:t>PDFBox</w:t>
+      </w:r>
+      <w:proofErr w:type="spellEnd"/>
+      <w:r>
+        <w:t>; the quality of extraction is constrained by the structure of the source PDF (e.g., scanned image-only PDFs without OCR are not guaranteed to extract cleanly).</w:t>
+      </w:r>
+    </w:p>
+    <w:p>
+      <w:pPr>
+        <w:pStyle w:val="ListParagraph"/>
+        <w:numPr>
+          <w:ilvl w:val="0"/>
+          <w:numId w:val="2"/>
+        </w:numPr>
+      </w:pPr>
+      <w:r>
+        <w:t>Persistent storage uses SQLite for local storage; Firebase is being evaluated as an alternative or supplement and is noted as TBD (see Appendix C).</w:t>
+      </w:r>
+    </w:p>
+    <w:p>
+      <w:pPr>
+        <w:pStyle w:val="ListParagraph"/>
+        <w:numPr>
+          <w:ilvl w:val="0"/>
+          <w:numId w:val="2"/>
+        </w:numPr>
+      </w:pPr>
+      <w:r>
+        <w:t xml:space="preserve">The project follows SCRUM methodology with sprints tracked in </w:t>
+      </w:r>
+      <w:proofErr w:type="spellStart"/>
+      <w:r>
+        <w:t>YouTrack</w:t>
+      </w:r>
+      <w:proofErr w:type="spellEnd"/>
+      <w:r>
+        <w:t>, which constrains how requirements are decomposed into backlog items and delivered incrementally across sprints.</w:t>
+      </w:r>
+    </w:p>
+    <w:p>
+      <w:pPr>
+        <w:pStyle w:val="ListParagraph"/>
+        <w:numPr>
+          <w:ilvl w:val="0"/>
+          <w:numId w:val="2"/>
+        </w:numPr>
+      </w:pPr>
+      <w:r>
+        <w:t>API keys for AI services must not be hard-coded or exposed in client-distributed code (see NFR-6).</w:t>
+      </w:r>
+    </w:p>
+    <w:p>
+      <w:pPr>
+        <w:pStyle w:val="ListParagraph"/>
+        <w:ind w:left="720"/>
+      </w:pPr>
+    </w:p>
+    <w:p>
+      <w:pPr>
+        <w:pStyle w:val="Heading2"/>
+        <w:spacing w:before="0" w:after="0"/>
+      </w:pPr>
+      <w:r>
+        <w:t>2.6 User Documentation</w:t>
+      </w:r>
+    </w:p>
+    <w:p>
+      <w:r>
+        <w:t>The following user documentation will be delivered alongside the software:</w:t>
+      </w:r>
+    </w:p>
+    <w:p>
+      <w:pPr>
+        <w:pStyle w:val="ListParagraph"/>
+        <w:numPr>
+          <w:ilvl w:val="0"/>
+          <w:numId w:val="2"/>
+        </w:numPr>
+      </w:pPr>
+      <w:r>
+        <w:t>A user guide (PDF or in-app help) covering document upload, dashboard navigation, and history/search.</w:t>
+      </w:r>
+    </w:p>
+    <w:p>
+      <w:pPr>
+        <w:pStyle w:val="ListParagraph"/>
+        <w:numPr>
+          <w:ilvl w:val="0"/>
+          <w:numId w:val="2"/>
+        </w:numPr>
+      </w:pPr>
+      <w:r>
+        <w:t>In-application tooltips and basic on-screen guidance for first-time users, consistent with NFR-9 (minimal training required).</w:t>
+      </w:r>
+    </w:p>
+    <w:p>
+      <w:pPr>
+        <w:pStyle w:val="ListParagraph"/>
+        <w:numPr>
+          <w:ilvl w:val="0"/>
+          <w:numId w:val="2"/>
+        </w:numPr>
+      </w:pPr>
+      <w:r>
+        <w:t>A README describing setup, build, and run instructions for development and grading purposes.</w:t>
+      </w:r>
+    </w:p>
+    <w:p>
+      <w:pPr>
+        <w:pStyle w:val="ListParagraph"/>
+        <w:ind w:left="720"/>
+      </w:pPr>
+    </w:p>
+    <w:p>
+      <w:pPr>
+        <w:pStyle w:val="Heading2"/>
+        <w:spacing w:before="0" w:after="0"/>
+      </w:pPr>
+      <w:r>
+        <w:t>2.7 Assumptions and Dependencies</w:t>
+      </w:r>
+    </w:p>
+    <w:p>
+      <w:pPr>
+        <w:pStyle w:val="ListParagraph"/>
+        <w:numPr>
+          <w:ilvl w:val="0"/>
+          <w:numId w:val="2"/>
+        </w:numPr>
+      </w:pPr>
+      <w:r>
+        <w:t>Users have a working internet connection at the time of AI analysis.</w:t>
+      </w:r>
+    </w:p>
+    <w:p>
+      <w:pPr>
+        <w:pStyle w:val="ListParagraph"/>
+        <w:numPr>
+          <w:ilvl w:val="0"/>
+          <w:numId w:val="2"/>
+        </w:numPr>
+      </w:pPr>
+      <w:r>
+        <w:t>Uploaded documents are valid, well-formed PDF files.</w:t>
+      </w:r>
+    </w:p>
+    <w:p>
+      <w:pPr>
+        <w:pStyle w:val="ListParagraph"/>
+        <w:numPr>
+          <w:ilvl w:val="0"/>
+          <w:numId w:val="2"/>
+        </w:numPr>
+      </w:pPr>
+      <w:r>
+        <w:t>The AI APIs (OpenAI and/or Google Gemini) remain available, accessible, and within usage limits/budget for the duration of the project.</w:t>
+      </w:r>
+    </w:p>
+    <w:p>
+      <w:pPr>
+        <w:pStyle w:val="ListParagraph"/>
+        <w:numPr>
+          <w:ilvl w:val="0"/>
+          <w:numId w:val="2"/>
+        </w:numPr>
+      </w:pPr>
+      <w:r>
+        <w:t>Uploaded financial documents are in English.</w:t>
+      </w:r>
+    </w:p>
+    <w:p>
+      <w:pPr>
+        <w:pStyle w:val="ListParagraph"/>
+        <w:numPr>
+          <w:ilvl w:val="0"/>
+          <w:numId w:val="2"/>
+        </w:numPr>
+      </w:pPr>
+      <w:r>
+        <w:t>The team has or can obtain valid API credentials for at least one supported AI provider for development and demonstration purposes.</w:t>
+      </w:r>
+    </w:p>
+    <w:p>
+      <w:pPr>
+        <w:pStyle w:val="ListParagraph"/>
+        <w:numPr>
+          <w:ilvl w:val="0"/>
+          <w:numId w:val="2"/>
+        </w:numPr>
+      </w:pPr>
+      <w:r>
         <w:lastRenderedPageBreak/>
-        <w:t>2.4 Operating Environment</w:t>
-      </w:r>
-    </w:p>
-    <w:p>
-      <w:r>
-        <w:t>The application shall operate as a standalone desktop program on the following operating systems:</w:t>
-      </w:r>
-    </w:p>
-    <w:p>
-      <w:pPr>
-        <w:pStyle w:val="ListParagraph"/>
-        <w:numPr>
-          <w:ilvl w:val="0"/>
-          <w:numId w:val="2"/>
-        </w:numPr>
-      </w:pPr>
-      <w:r>
-        <w:t>Windows 10 or later</w:t>
-      </w:r>
-    </w:p>
-    <w:p>
-      <w:pPr>
-        <w:pStyle w:val="ListParagraph"/>
-        <w:numPr>
-          <w:ilvl w:val="0"/>
-          <w:numId w:val="2"/>
-        </w:numPr>
-      </w:pPr>
-      <w:r>
-        <w:t>macOS 12 or later</w:t>
-      </w:r>
-    </w:p>
-    <w:p>
-      <w:pPr>
-        <w:pStyle w:val="ListParagraph"/>
-        <w:numPr>
-          <w:ilvl w:val="0"/>
-          <w:numId w:val="2"/>
-        </w:numPr>
-      </w:pPr>
-      <w:r>
-        <w:t>Linux distributions with a supported JavaFX runtime (Ubuntu 20.04 or later)</w:t>
-      </w:r>
-    </w:p>
-    <w:p>
-      <w:pPr>
-        <w:pStyle w:val="ListParagraph"/>
-        <w:ind w:left="720"/>
-      </w:pPr>
-    </w:p>
-    <w:p>
-      <w:r>
-        <w:t>The application requires a Java Runtime Environment compatible with JavaFX (Java 17 or later recommended), a local SQLite database file stored on the host filesystem, and an active internet connection for AI API calls (Section 3.3). No specific minimum hardware beyond what is required to run a modern JVM and JavaFX UI is assumed.</w:t>
-      </w:r>
-    </w:p>
-    <w:p/>
-    <w:p>
-      <w:pPr>
-        <w:pStyle w:val="Heading2"/>
-        <w:spacing w:before="0" w:after="0"/>
-      </w:pPr>
-      <w:r>
-        <w:t>2.5 Design and Implementation Constraints</w:t>
-      </w:r>
-    </w:p>
-    <w:p>
-      <w:pPr>
-        <w:pStyle w:val="ListParagraph"/>
-        <w:numPr>
-          <w:ilvl w:val="0"/>
-          <w:numId w:val="2"/>
-        </w:numPr>
-      </w:pPr>
-      <w:r>
-        <w:t>The application must be developed using Java, with JavaFX for the graphical user interface, per course requirements.</w:t>
-      </w:r>
-    </w:p>
-    <w:p>
-      <w:pPr>
-        <w:pStyle w:val="ListParagraph"/>
-        <w:numPr>
-          <w:ilvl w:val="0"/>
-          <w:numId w:val="2"/>
-        </w:numPr>
-      </w:pPr>
-      <w:r>
-        <w:t>The project must be completed within the CSC 325 course timeline (Summer 2026 term), including a mid-point presentation and final submission.</w:t>
-      </w:r>
-    </w:p>
-    <w:p>
-      <w:pPr>
-        <w:pStyle w:val="ListParagraph"/>
-        <w:numPr>
-          <w:ilvl w:val="0"/>
-          <w:numId w:val="2"/>
-        </w:numPr>
-      </w:pPr>
-      <w:r>
-        <w:t>AI functionality is dependent on third-party external APIs (OpenAI API and/or Google Gemini API); the system has no control over their availability, rate limits, or pricing changes.</w:t>
-      </w:r>
-    </w:p>
-    <w:p>
-      <w:pPr>
-        <w:pStyle w:val="ListParagraph"/>
-        <w:numPr>
-          <w:ilvl w:val="0"/>
-          <w:numId w:val="2"/>
-        </w:numPr>
-      </w:pPr>
-      <w:r>
-        <w:t xml:space="preserve">PDF text extraction is performed using Apache </w:t>
+        <w:t xml:space="preserve">Apache </w:t>
       </w:r>
       <w:proofErr w:type="spellStart"/>
       <w:r>
@@ -1247,201 +1530,6 @@
       </w:r>
       <w:proofErr w:type="spellEnd"/>
       <w:r>
-        <w:t>; the quality of extraction is constrained by the structure of the source PDF (e.g., scanned image-only PDFs without OCR are not guaranteed to extract cleanly).</w:t>
-      </w:r>
-    </w:p>
-    <w:p>
-      <w:pPr>
-        <w:pStyle w:val="ListParagraph"/>
-        <w:numPr>
-          <w:ilvl w:val="0"/>
-          <w:numId w:val="2"/>
-        </w:numPr>
-      </w:pPr>
-      <w:r>
-        <w:t>Persistent storage uses SQLite for local storage; Firebase is being evaluated as an alternative or supplement and is noted as TBD (see Appendix C).</w:t>
-      </w:r>
-    </w:p>
-    <w:p>
-      <w:pPr>
-        <w:pStyle w:val="ListParagraph"/>
-        <w:numPr>
-          <w:ilvl w:val="0"/>
-          <w:numId w:val="2"/>
-        </w:numPr>
-      </w:pPr>
-      <w:r>
-        <w:t xml:space="preserve">The project follows SCRUM methodology with sprints tracked in </w:t>
-      </w:r>
-      <w:proofErr w:type="spellStart"/>
-      <w:r>
-        <w:t>YouTrack</w:t>
-      </w:r>
-      <w:proofErr w:type="spellEnd"/>
-      <w:r>
-        <w:t>, which constrains how requirements are decomposed into backlog items and delivered incrementally across sprints.</w:t>
-      </w:r>
-    </w:p>
-    <w:p>
-      <w:pPr>
-        <w:pStyle w:val="ListParagraph"/>
-        <w:numPr>
-          <w:ilvl w:val="0"/>
-          <w:numId w:val="2"/>
-        </w:numPr>
-      </w:pPr>
-      <w:r>
-        <w:t>API keys for AI services must not be hard-coded or exposed in client-distributed code (see NFR-6).</w:t>
-      </w:r>
-    </w:p>
-    <w:p>
-      <w:pPr>
-        <w:pStyle w:val="ListParagraph"/>
-        <w:ind w:left="720"/>
-      </w:pPr>
-    </w:p>
-    <w:p>
-      <w:pPr>
-        <w:pStyle w:val="Heading2"/>
-        <w:spacing w:before="0" w:after="0"/>
-      </w:pPr>
-      <w:r>
-        <w:t>2.6 User Documentation</w:t>
-      </w:r>
-    </w:p>
-    <w:p>
-      <w:r>
-        <w:t>The following user documentation will be delivered alongside the software:</w:t>
-      </w:r>
-    </w:p>
-    <w:p>
-      <w:pPr>
-        <w:pStyle w:val="ListParagraph"/>
-        <w:numPr>
-          <w:ilvl w:val="0"/>
-          <w:numId w:val="2"/>
-        </w:numPr>
-      </w:pPr>
-      <w:r>
-        <w:t>A user guide (PDF or in-app help) covering document upload, dashboard navigation, and history/search.</w:t>
-      </w:r>
-    </w:p>
-    <w:p>
-      <w:pPr>
-        <w:pStyle w:val="ListParagraph"/>
-        <w:numPr>
-          <w:ilvl w:val="0"/>
-          <w:numId w:val="2"/>
-        </w:numPr>
-      </w:pPr>
-      <w:r>
-        <w:t>In-application tooltips and basic on-screen guidance for first-time users, consistent with NFR-9 (minimal training required).</w:t>
-      </w:r>
-    </w:p>
-    <w:p>
-      <w:pPr>
-        <w:pStyle w:val="ListParagraph"/>
-        <w:numPr>
-          <w:ilvl w:val="0"/>
-          <w:numId w:val="2"/>
-        </w:numPr>
-      </w:pPr>
-      <w:r>
-        <w:t>A README describing setup, build, and run instructions for development and grading purposes.</w:t>
-      </w:r>
-    </w:p>
-    <w:p>
-      <w:pPr>
-        <w:pStyle w:val="ListParagraph"/>
-        <w:ind w:left="720"/>
-      </w:pPr>
-    </w:p>
-    <w:p>
-      <w:pPr>
-        <w:pStyle w:val="Heading2"/>
-        <w:spacing w:before="0" w:after="0"/>
-      </w:pPr>
-      <w:r>
-        <w:t>2.7 Assumptions and Dependencies</w:t>
-      </w:r>
-    </w:p>
-    <w:p>
-      <w:pPr>
-        <w:pStyle w:val="ListParagraph"/>
-        <w:numPr>
-          <w:ilvl w:val="0"/>
-          <w:numId w:val="2"/>
-        </w:numPr>
-      </w:pPr>
-      <w:r>
-        <w:t>Users have a working internet connection at the time of AI analysis.</w:t>
-      </w:r>
-    </w:p>
-    <w:p>
-      <w:pPr>
-        <w:pStyle w:val="ListParagraph"/>
-        <w:numPr>
-          <w:ilvl w:val="0"/>
-          <w:numId w:val="2"/>
-        </w:numPr>
-      </w:pPr>
-      <w:r>
-        <w:t>Uploaded documents are valid, well-formed PDF files.</w:t>
-      </w:r>
-    </w:p>
-    <w:p>
-      <w:pPr>
-        <w:pStyle w:val="ListParagraph"/>
-        <w:numPr>
-          <w:ilvl w:val="0"/>
-          <w:numId w:val="2"/>
-        </w:numPr>
-      </w:pPr>
-      <w:r>
-        <w:t>The AI APIs (OpenAI and/or Google Gemini) remain available, accessible, and within usage limits/budget for the duration of the project.</w:t>
-      </w:r>
-    </w:p>
-    <w:p>
-      <w:pPr>
-        <w:pStyle w:val="ListParagraph"/>
-        <w:numPr>
-          <w:ilvl w:val="0"/>
-          <w:numId w:val="2"/>
-        </w:numPr>
-      </w:pPr>
-      <w:r>
-        <w:t>Uploaded financial documents are in English.</w:t>
-      </w:r>
-    </w:p>
-    <w:p>
-      <w:pPr>
-        <w:pStyle w:val="ListParagraph"/>
-        <w:numPr>
-          <w:ilvl w:val="0"/>
-          <w:numId w:val="2"/>
-        </w:numPr>
-      </w:pPr>
-      <w:r>
-        <w:t>The team has or can obtain valid API credentials for at least one supported AI provider for development and demonstration purposes.</w:t>
-      </w:r>
-    </w:p>
-    <w:p>
-      <w:pPr>
-        <w:pStyle w:val="ListParagraph"/>
-        <w:numPr>
-          <w:ilvl w:val="0"/>
-          <w:numId w:val="2"/>
-        </w:numPr>
-      </w:pPr>
-      <w:r>
-        <w:t xml:space="preserve">Apache </w:t>
-      </w:r>
-      <w:proofErr w:type="spellStart"/>
-      <w:r>
-        <w:t>PDFBox</w:t>
-      </w:r>
-      <w:proofErr w:type="spellEnd"/>
-      <w:r>
         <w:t xml:space="preserve"> is suitable for extracting text from the range of sample financial documents used for testing and demonstration.</w:t>
       </w:r>
     </w:p>
@@ -1450,11 +1538,13 @@
         <w:pStyle w:val="Heading1"/>
         <w:spacing w:before="0" w:after="0"/>
       </w:pPr>
-      <w:r>
-        <w:br w:type="page"/>
-      </w:r>
-      <w:r>
-        <w:lastRenderedPageBreak/>
+    </w:p>
+    <w:p>
+      <w:pPr>
+        <w:pStyle w:val="Heading1"/>
+        <w:spacing w:before="0" w:after="0"/>
+      </w:pPr>
+      <w:r>
         <w:t>3. External Interface Requirements</w:t>
       </w:r>
     </w:p>
@@ -1608,12 +1698,6 @@
         <w:gridCol w:w="3800"/>
       </w:tblGrid>
       <w:tr>
-        <w:tblPrEx>
-          <w:tblCellMar>
-            <w:top w:w="0" w:type="dxa"/>
-            <w:bottom w:w="0" w:type="dxa"/>
-          </w:tblCellMar>
-        </w:tblPrEx>
         <w:trPr>
           <w:tblHeader/>
         </w:trPr>
@@ -1706,12 +1790,6 @@
         </w:tc>
       </w:tr>
       <w:tr>
-        <w:tblPrEx>
-          <w:tblCellMar>
-            <w:top w:w="0" w:type="dxa"/>
-            <w:bottom w:w="0" w:type="dxa"/>
-          </w:tblCellMar>
-        </w:tblPrEx>
         <w:tc>
           <w:tcPr>
             <w:tcW w:w="2400" w:type="dxa"/>
@@ -1786,12 +1864,6 @@
         </w:tc>
       </w:tr>
       <w:tr>
-        <w:tblPrEx>
-          <w:tblCellMar>
-            <w:top w:w="0" w:type="dxa"/>
-            <w:bottom w:w="0" w:type="dxa"/>
-          </w:tblCellMar>
-        </w:tblPrEx>
         <w:tc>
           <w:tcPr>
             <w:tcW w:w="2400" w:type="dxa"/>
@@ -1866,12 +1938,6 @@
         </w:tc>
       </w:tr>
       <w:tr>
-        <w:tblPrEx>
-          <w:tblCellMar>
-            <w:top w:w="0" w:type="dxa"/>
-            <w:bottom w:w="0" w:type="dxa"/>
-          </w:tblCellMar>
-        </w:tblPrEx>
         <w:tc>
           <w:tcPr>
             <w:tcW w:w="2400" w:type="dxa"/>
@@ -1951,12 +2017,6 @@
         </w:tc>
       </w:tr>
       <w:tr>
-        <w:tblPrEx>
-          <w:tblCellMar>
-            <w:top w:w="0" w:type="dxa"/>
-            <w:bottom w:w="0" w:type="dxa"/>
-          </w:tblCellMar>
-        </w:tblPrEx>
         <w:tc>
           <w:tcPr>
             <w:tcW w:w="2400" w:type="dxa"/>
@@ -2034,7 +2094,11 @@
     <w:p/>
     <w:p>
       <w:r>
-        <w:t>Data flowing into the AI services consists of extracted document text (and minimal contextual metadata such as document type, if available); data flowing out consists of structured or semi-structured summary text, key financial insights, and recommendations, which the backend parses and persists via the database interface. Detailed request/response schemas for each AI provider are to be documented in a separate API integration reference as development proceeds (see Appendix C).</w:t>
+        <w:t>Data flowing into the AI services consists of extracted document text (and minimal contextual metadata such as document type, if available); data flowing out consists of structured or semi-</w:t>
+      </w:r>
+      <w:r>
+        <w:lastRenderedPageBreak/>
+        <w:t>structured summary text, key financial insights, and recommendations, which the backend parses and persists via the database interface. Detailed request/response schemas for each AI provider are to be documented in a separate API integration reference as development proceeds (see Appendix C).</w:t>
       </w:r>
     </w:p>
     <w:p>
@@ -2042,8 +2106,13 @@
         <w:pStyle w:val="Heading2"/>
         <w:spacing w:before="0" w:after="0"/>
       </w:pPr>
-      <w:r>
-        <w:lastRenderedPageBreak/>
+    </w:p>
+    <w:p>
+      <w:pPr>
+        <w:pStyle w:val="Heading2"/>
+        <w:spacing w:before="0" w:after="0"/>
+      </w:pPr>
+      <w:r>
         <w:t>3.4 Communications Interfaces</w:t>
       </w:r>
     </w:p>
@@ -2335,6 +2404,7 @@
         </w:numPr>
       </w:pPr>
       <w:r>
+        <w:lastRenderedPageBreak/>
         <w:t xml:space="preserve">Extraction fails (corrupted or image-only PDF) </w:t>
       </w:r>
       <w:r>
@@ -2357,6 +2427,694 @@
       </w:pPr>
       <w:r>
         <w:t>4.2.3 Functional Requirements</w:t>
+      </w:r>
+    </w:p>
+    <w:p>
+      <w:r>
+        <w:rPr>
+          <w:b/>
+          <w:bCs/>
+        </w:rPr>
+        <w:t xml:space="preserve">FR-2.1:  </w:t>
+      </w:r>
+      <w:r>
+        <w:t>The system shall read the contents of an uploaded PDF document using the PDF processing engine.</w:t>
+      </w:r>
+    </w:p>
+    <w:p>
+      <w:r>
+        <w:rPr>
+          <w:b/>
+          <w:bCs/>
+        </w:rPr>
+        <w:t xml:space="preserve">FR-2.2:  </w:t>
+      </w:r>
+      <w:r>
+        <w:t>The system shall extract textual content from the PDF document.</w:t>
+      </w:r>
+    </w:p>
+    <w:p>
+      <w:r>
+        <w:rPr>
+          <w:b/>
+          <w:bCs/>
+        </w:rPr>
+        <w:t xml:space="preserve">FR-2.3:  </w:t>
+      </w:r>
+      <w:r>
+        <w:t>The system shall identify financial information (monetary amounts, dates, line items) within the extracted text where structurally identifiable.</w:t>
+      </w:r>
+    </w:p>
+    <w:p>
+      <w:r>
+        <w:rPr>
+          <w:b/>
+          <w:bCs/>
+        </w:rPr>
+        <w:t xml:space="preserve">FR-2.4:  </w:t>
+      </w:r>
+      <w:r>
+        <w:t>The system shall store the extracted text associated with its source document for later retrieval and analysis.</w:t>
+      </w:r>
+    </w:p>
+    <w:p>
+      <w:pPr>
+        <w:pStyle w:val="Heading2"/>
+        <w:spacing w:before="0" w:after="0"/>
+      </w:pPr>
+    </w:p>
+    <w:p>
+      <w:pPr>
+        <w:pStyle w:val="Heading2"/>
+        <w:spacing w:before="0" w:after="0"/>
+      </w:pPr>
+      <w:r>
+        <w:t>4.3 AI Analysis</w:t>
+      </w:r>
+    </w:p>
+    <w:p>
+      <w:pPr>
+        <w:pStyle w:val="Heading3"/>
+        <w:spacing w:before="0" w:after="0"/>
+      </w:pPr>
+      <w:r>
+        <w:t>4.3.1 Description and Priority</w:t>
+      </w:r>
+    </w:p>
+    <w:p>
+      <w:r>
+        <w:t xml:space="preserve">Uses an external AI service to analyze extracted financial document text and generate summaries, insights, and recommendations. Priority: High </w:t>
+      </w:r>
+      <w:r>
+        <w:t xml:space="preserve">- </w:t>
+      </w:r>
+      <w:r>
+        <w:t>this is the core value proposition of the application.</w:t>
+      </w:r>
+    </w:p>
+    <w:p>
+      <w:pPr>
+        <w:pStyle w:val="Heading3"/>
+        <w:spacing w:before="0" w:after="0"/>
+      </w:pPr>
+    </w:p>
+    <w:p>
+      <w:pPr>
+        <w:pStyle w:val="Heading3"/>
+        <w:spacing w:before="0" w:after="0"/>
+      </w:pPr>
+      <w:r>
+        <w:t>4.3.2 Stimulus/Response Sequences</w:t>
+      </w:r>
+    </w:p>
+    <w:p>
+      <w:pPr>
+        <w:pStyle w:val="ListParagraph"/>
+        <w:numPr>
+          <w:ilvl w:val="0"/>
+          <w:numId w:val="2"/>
+        </w:numPr>
+      </w:pPr>
+      <w:r>
+        <w:t xml:space="preserve">Text extraction completes </w:t>
+      </w:r>
+      <w:r>
+        <w:t xml:space="preserve">- </w:t>
+      </w:r>
+      <w:r>
+        <w:t xml:space="preserve">user initiates analysis </w:t>
+      </w:r>
+      <w:r>
+        <w:t>-</w:t>
+      </w:r>
+      <w:r>
+        <w:t xml:space="preserve"> system submits extracted text to the configured AI service.</w:t>
+      </w:r>
+    </w:p>
+    <w:p>
+      <w:pPr>
+        <w:pStyle w:val="ListParagraph"/>
+        <w:numPr>
+          <w:ilvl w:val="0"/>
+          <w:numId w:val="2"/>
+        </w:numPr>
+      </w:pPr>
+      <w:r>
+        <w:t xml:space="preserve">AI service returns a response </w:t>
+      </w:r>
+      <w:r>
+        <w:t>-</w:t>
+      </w:r>
+      <w:r>
+        <w:t xml:space="preserve"> system parses the summary, insights, and recommendations and displays them to the user.</w:t>
+      </w:r>
+    </w:p>
+    <w:p>
+      <w:pPr>
+        <w:pStyle w:val="ListParagraph"/>
+        <w:numPr>
+          <w:ilvl w:val="0"/>
+          <w:numId w:val="2"/>
+        </w:numPr>
+      </w:pPr>
+      <w:r>
+        <w:t xml:space="preserve">AI service call fails or times out </w:t>
+      </w:r>
+      <w:r>
+        <w:t>-</w:t>
+      </w:r>
+      <w:r>
+        <w:t xml:space="preserve"> system displays an error and allows the user to retry (see NFR-3).</w:t>
+      </w:r>
+    </w:p>
+    <w:p>
+      <w:pPr>
+        <w:pStyle w:val="Heading3"/>
+        <w:spacing w:before="0" w:after="0"/>
+      </w:pPr>
+    </w:p>
+    <w:p>
+      <w:pPr>
+        <w:pStyle w:val="Heading3"/>
+        <w:spacing w:before="0" w:after="0"/>
+      </w:pPr>
+      <w:r>
+        <w:t>4.3.3 Functional Requirements</w:t>
+      </w:r>
+    </w:p>
+    <w:p>
+      <w:r>
+        <w:rPr>
+          <w:b/>
+          <w:bCs/>
+        </w:rPr>
+        <w:t xml:space="preserve">FR-3.1:  </w:t>
+      </w:r>
+      <w:r>
+        <w:t>The system shall submit extracted document text to a configured AI service (OpenAI API or Google Gemini API) for analysis.</w:t>
+      </w:r>
+    </w:p>
+    <w:p>
+      <w:r>
+        <w:rPr>
+          <w:b/>
+          <w:bCs/>
+        </w:rPr>
+        <w:t xml:space="preserve">FR-3.2:  </w:t>
+      </w:r>
+      <w:r>
+        <w:t>The system shall generate a natural-language summary of each analyzed document.</w:t>
+      </w:r>
+    </w:p>
+    <w:p>
+      <w:r>
+        <w:rPr>
+          <w:b/>
+          <w:bCs/>
+        </w:rPr>
+        <w:t xml:space="preserve">FR-3.3:  </w:t>
+      </w:r>
+      <w:r>
+        <w:t>The system shall identify and present important financial insights extracted from the AI analysis.</w:t>
+      </w:r>
+    </w:p>
+    <w:p>
+      <w:r>
+        <w:rPr>
+          <w:b/>
+          <w:bCs/>
+        </w:rPr>
+        <w:t xml:space="preserve">FR-3.4:  </w:t>
+      </w:r>
+      <w:r>
+        <w:t>The system shall return AI-generated recommendations associated with the analyzed document.</w:t>
+      </w:r>
+    </w:p>
+    <w:p>
+      <w:r>
+        <w:rPr>
+          <w:b/>
+          <w:bCs/>
+        </w:rPr>
+        <w:t xml:space="preserve">FR-3.5:  </w:t>
+      </w:r>
+      <w:r>
+        <w:t>The system shall display the AI analysis results (summary, insights, recommendations) to the user within the application interface.</w:t>
+      </w:r>
+    </w:p>
+    <w:p>
+      <w:pPr>
+        <w:pStyle w:val="Heading2"/>
+        <w:spacing w:before="0" w:after="0"/>
+      </w:pPr>
+    </w:p>
+    <w:p>
+      <w:pPr>
+        <w:pStyle w:val="Heading2"/>
+        <w:spacing w:before="0" w:after="0"/>
+      </w:pPr>
+      <w:r>
+        <w:t>4.4 Document History</w:t>
+      </w:r>
+    </w:p>
+    <w:p>
+      <w:pPr>
+        <w:pStyle w:val="Heading3"/>
+        <w:spacing w:before="0" w:after="0"/>
+      </w:pPr>
+      <w:r>
+        <w:t>4.4.1 Description and Priority</w:t>
+      </w:r>
+    </w:p>
+    <w:p>
+      <w:r>
+        <w:t xml:space="preserve">Allows users to review previously processed documents and their AI-generated results. Priority: Medium </w:t>
+      </w:r>
+      <w:r>
+        <w:t>-</w:t>
+      </w:r>
+      <w:r>
+        <w:t xml:space="preserve"> important for usability but not required for a minimal end-to-end demo.</w:t>
+      </w:r>
+    </w:p>
+    <w:p>
+      <w:pPr>
+        <w:pStyle w:val="Heading3"/>
+        <w:spacing w:before="0" w:after="0"/>
+      </w:pPr>
+    </w:p>
+    <w:p>
+      <w:pPr>
+        <w:pStyle w:val="Heading3"/>
+        <w:spacing w:before="0" w:after="0"/>
+      </w:pPr>
+      <w:r>
+        <w:t>4.4.2 Stimulus/Response Sequences</w:t>
+      </w:r>
+    </w:p>
+    <w:p>
+      <w:pPr>
+        <w:pStyle w:val="ListParagraph"/>
+        <w:numPr>
+          <w:ilvl w:val="0"/>
+          <w:numId w:val="2"/>
+        </w:numPr>
+      </w:pPr>
+      <w:r>
+        <w:t xml:space="preserve">AI analysis completes </w:t>
+      </w:r>
+      <w:r>
+        <w:t xml:space="preserve">- </w:t>
+      </w:r>
+      <w:r>
+        <w:t>system stores document metadata and results in the local database</w:t>
+      </w:r>
+    </w:p>
+    <w:p>
+      <w:pPr>
+        <w:pStyle w:val="ListParagraph"/>
+        <w:numPr>
+          <w:ilvl w:val="0"/>
+          <w:numId w:val="2"/>
+        </w:numPr>
+      </w:pPr>
+      <w:r>
+        <w:t xml:space="preserve">User opens the History screen </w:t>
+      </w:r>
+      <w:r>
+        <w:t>-</w:t>
+      </w:r>
+      <w:r>
+        <w:t xml:space="preserve"> system displays a list of previously processed documents.</w:t>
+      </w:r>
+    </w:p>
+    <w:p>
+      <w:pPr>
+        <w:pStyle w:val="ListParagraph"/>
+        <w:numPr>
+          <w:ilvl w:val="0"/>
+          <w:numId w:val="2"/>
+        </w:numPr>
+      </w:pPr>
+      <w:r>
+        <w:t xml:space="preserve">User enters a search term </w:t>
+      </w:r>
+      <w:r>
+        <w:t>-</w:t>
+      </w:r>
+      <w:r>
+        <w:t xml:space="preserve"> system filters the document list to matching results.</w:t>
+      </w:r>
+    </w:p>
+    <w:p>
+      <w:pPr>
+        <w:pStyle w:val="Heading3"/>
+        <w:spacing w:before="0" w:after="0"/>
+      </w:pPr>
+    </w:p>
+    <w:p>
+      <w:pPr>
+        <w:pStyle w:val="Heading3"/>
+        <w:spacing w:before="0" w:after="0"/>
+      </w:pPr>
+      <w:r>
+        <w:lastRenderedPageBreak/>
+        <w:t>4.4.3 Functional Requirements</w:t>
+      </w:r>
+    </w:p>
+    <w:p>
+      <w:r>
+        <w:rPr>
+          <w:b/>
+          <w:bCs/>
+        </w:rPr>
+        <w:t xml:space="preserve">FR-4.1:  </w:t>
+      </w:r>
+      <w:r>
+        <w:t>The system shall store metadata (</w:t>
+      </w:r>
+      <w:r>
+        <w:t>file</w:t>
+      </w:r>
+      <w:r>
+        <w:t xml:space="preserve"> name, upload date) for each processed document.</w:t>
+      </w:r>
+    </w:p>
+    <w:p>
+      <w:r>
+        <w:rPr>
+          <w:b/>
+          <w:bCs/>
+        </w:rPr>
+        <w:t xml:space="preserve">FR-4.2:  </w:t>
+      </w:r>
+      <w:r>
+        <w:t>The system shall save AI-generated results associated with each processed document.</w:t>
+      </w:r>
+    </w:p>
+    <w:p>
+      <w:r>
+        <w:rPr>
+          <w:b/>
+          <w:bCs/>
+        </w:rPr>
+        <w:t xml:space="preserve">FR-4.3:  </w:t>
+      </w:r>
+      <w:r>
+        <w:t>The system shall allow users to view previously generated analyses from the Document History screen.</w:t>
+      </w:r>
+    </w:p>
+    <w:p>
+      <w:r>
+        <w:rPr>
+          <w:b/>
+          <w:bCs/>
+        </w:rPr>
+        <w:t xml:space="preserve">FR-4.4:  </w:t>
+      </w:r>
+      <w:r>
+        <w:t>The system shall support keyword-based search over stored document history.</w:t>
+      </w:r>
+    </w:p>
+    <w:p>
+      <w:pPr>
+        <w:pStyle w:val="Heading2"/>
+        <w:spacing w:before="0" w:after="0"/>
+      </w:pPr>
+    </w:p>
+    <w:p>
+      <w:pPr>
+        <w:pStyle w:val="Heading2"/>
+        <w:spacing w:before="0" w:after="0"/>
+      </w:pPr>
+      <w:r>
+        <w:t>4.5 Dashboard</w:t>
+      </w:r>
+    </w:p>
+    <w:p>
+      <w:pPr>
+        <w:pStyle w:val="Heading3"/>
+        <w:spacing w:before="0" w:after="0"/>
+      </w:pPr>
+      <w:r>
+        <w:t>4.5.1 Description and Priority</w:t>
+      </w:r>
+    </w:p>
+    <w:p>
+      <w:r>
+        <w:t xml:space="preserve">Provides a consolidated view of uploaded documents, summary statistics, and AI analysis results. Priority: Medium </w:t>
+      </w:r>
+      <w:r>
+        <w:t>-</w:t>
+      </w:r>
+      <w:r>
+        <w:t xml:space="preserve"> enhances usability and supports the project’s reporting goals.</w:t>
+      </w:r>
+    </w:p>
+    <w:p>
+      <w:pPr>
+        <w:pStyle w:val="Heading3"/>
+        <w:spacing w:before="0" w:after="0"/>
+      </w:pPr>
+    </w:p>
+    <w:p>
+      <w:pPr>
+        <w:pStyle w:val="Heading3"/>
+        <w:spacing w:before="0" w:after="0"/>
+      </w:pPr>
+      <w:r>
+        <w:t>4.5.2 Stimulus/Response Sequences</w:t>
+      </w:r>
+    </w:p>
+    <w:p>
+      <w:pPr>
+        <w:pStyle w:val="ListParagraph"/>
+        <w:numPr>
+          <w:ilvl w:val="0"/>
+          <w:numId w:val="2"/>
+        </w:numPr>
+      </w:pPr>
+      <w:r>
+        <w:t xml:space="preserve">User navigates to the Dashboard </w:t>
+      </w:r>
+      <w:r>
+        <w:t>-</w:t>
+      </w:r>
+      <w:r>
+        <w:t xml:space="preserve"> system displays uploaded documents and summary statistics.</w:t>
+      </w:r>
+    </w:p>
+    <w:p>
+      <w:pPr>
+        <w:pStyle w:val="ListParagraph"/>
+        <w:numPr>
+          <w:ilvl w:val="0"/>
+          <w:numId w:val="2"/>
+        </w:numPr>
+      </w:pPr>
+      <w:r>
+        <w:t xml:space="preserve">User selects a document from the dashboard </w:t>
+      </w:r>
+      <w:r>
+        <w:t>-</w:t>
+      </w:r>
+      <w:r>
+        <w:t xml:space="preserve"> system navigates to that document’s detailed AI analysis results.</w:t>
+      </w:r>
+    </w:p>
+    <w:p>
+      <w:pPr>
+        <w:pStyle w:val="Heading3"/>
+        <w:spacing w:before="0" w:after="0"/>
+      </w:pPr>
+    </w:p>
+    <w:p>
+      <w:pPr>
+        <w:pStyle w:val="Heading3"/>
+        <w:spacing w:before="0" w:after="0"/>
+      </w:pPr>
+      <w:r>
+        <w:t>4.5.3 Functional Requirements</w:t>
+      </w:r>
+    </w:p>
+    <w:p>
+      <w:r>
+        <w:rPr>
+          <w:b/>
+          <w:bCs/>
+        </w:rPr>
+        <w:t xml:space="preserve">FR-5.1:  </w:t>
+      </w:r>
+      <w:r>
+        <w:t>The system shall display a list of uploaded documents on the dashboard.</w:t>
+      </w:r>
+    </w:p>
+    <w:p>
+      <w:r>
+        <w:rPr>
+          <w:b/>
+          <w:bCs/>
+        </w:rPr>
+        <w:t xml:space="preserve">FR-5.2:  </w:t>
+      </w:r>
+      <w:r>
+        <w:t>The system shall display summary statistics (total documents processed) on the dashboard.</w:t>
+      </w:r>
+    </w:p>
+    <w:p>
+      <w:r>
+        <w:rPr>
+          <w:b/>
+          <w:bCs/>
+        </w:rPr>
+        <w:t xml:space="preserve">FR-5.3:  </w:t>
+      </w:r>
+      <w:r>
+        <w:t>The system shall display AI analysis results associated with selected documents on the dashboard.</w:t>
+      </w:r>
+    </w:p>
+    <w:p>
+      <w:r>
+        <w:rPr>
+          <w:b/>
+          <w:bCs/>
+        </w:rPr>
+        <w:t xml:space="preserve">FR-5.4:  </w:t>
+      </w:r>
+      <w:r>
+        <w:t>The system shall provide navigation controls allowing the user to move between the dashboard, upload, and history screens.</w:t>
+      </w:r>
+    </w:p>
+    <w:p/>
+    <w:p>
+      <w:pPr>
+        <w:pStyle w:val="Heading1"/>
+        <w:spacing w:before="0" w:after="0"/>
+      </w:pPr>
+      <w:r>
+        <w:t>5. Other Nonfunctional Requirements</w:t>
+      </w:r>
+    </w:p>
+    <w:p>
+      <w:pPr>
+        <w:pStyle w:val="Heading2"/>
+        <w:spacing w:before="0" w:after="0"/>
+      </w:pPr>
+      <w:r>
+        <w:t>5.1 Performance Requirements</w:t>
+      </w:r>
+    </w:p>
+    <w:p>
+      <w:r>
+        <w:rPr>
+          <w:b/>
+          <w:bCs/>
+        </w:rPr>
+        <w:t xml:space="preserve">NFR-1:  </w:t>
+      </w:r>
+      <w:r>
+        <w:t>The system shall process a single uploaded document (extraction plus AI analysis) within 30 seconds under normal conditions and typical AI service response times.</w:t>
+      </w:r>
+    </w:p>
+    <w:p>
+      <w:r>
+        <w:rPr>
+          <w:b/>
+          <w:bCs/>
+        </w:rPr>
+        <w:t xml:space="preserve">NFR-2:  </w:t>
+      </w:r>
+      <w:r>
+        <w:t>The system shall support multiple document uploads without requiring an application restart between uploads.</w:t>
+      </w:r>
+    </w:p>
+    <w:p>
+      <w:pPr>
+        <w:pStyle w:val="Heading2"/>
+        <w:spacing w:before="0" w:after="0"/>
+      </w:pPr>
+    </w:p>
+    <w:p>
+      <w:pPr>
+        <w:pStyle w:val="Heading2"/>
+        <w:spacing w:before="0" w:after="0"/>
+      </w:pPr>
+      <w:r>
+        <w:t>5.2 Safety Requirements</w:t>
+      </w:r>
+    </w:p>
+    <w:p>
+      <w:r>
+        <w:t>The application does not control physical hardware and presents no direct physical safety hazard. The primary “safety” concern for this product is preventing loss or corruption of financial data and avoiding actions that financially mislead the user.</w:t>
+      </w:r>
+    </w:p>
+    <w:p>
+      <w:r>
+        <w:rPr>
+          <w:b/>
+          <w:bCs/>
+        </w:rPr>
+        <w:t xml:space="preserve">NFR-3:  </w:t>
+      </w:r>
+      <w:r>
+        <w:t>The system shall recover gracefully from processing errors (</w:t>
+      </w:r>
+      <w:r>
+        <w:t>(</w:t>
+      </w:r>
+      <w:r>
+        <w:t>failed extraction or failed AI request) without crashing or losing previously saved data.</w:t>
+      </w:r>
+    </w:p>
+    <w:p>
+      <w:r>
+        <w:rPr>
+          <w:b/>
+          <w:bCs/>
+        </w:rPr>
+        <w:t xml:space="preserve">NFR-4:  </w:t>
+      </w:r>
+      <w:r>
+        <w:t>The system shall prevent data corruption of stored documents, metadata, and AI results, including during interrupted operations (application closed mid-save).</w:t>
+      </w:r>
+    </w:p>
+    <w:p>
+      <w:r>
+        <w:rPr>
+          <w:b/>
+          <w:bCs/>
+        </w:rPr>
+        <w:t xml:space="preserve">NFR-5*:  </w:t>
+      </w:r>
+      <w:r>
+        <w:t>The system shall present AI-generated recommendations as informational only and shall not represent them as certified financial, tax, or legal advice.</w:t>
+      </w:r>
+    </w:p>
+    <w:p>
+      <w:pPr>
+        <w:pStyle w:val="Heading2"/>
+        <w:spacing w:before="0" w:after="0"/>
+      </w:pPr>
+    </w:p>
+    <w:p>
+      <w:pPr>
+        <w:pStyle w:val="Heading2"/>
+        <w:spacing w:before="0" w:after="0"/>
+      </w:pPr>
+      <w:r>
+        <w:t>5.3 Security Requirements</w:t>
+      </w:r>
+    </w:p>
+    <w:p>
+      <w:r>
+        <w:rPr>
+          <w:b/>
+          <w:bCs/>
+        </w:rPr>
+        <w:t xml:space="preserve">NFR-6:  </w:t>
+      </w:r>
+      <w:r>
+        <w:t>Uploaded documents shall be stored securely on the local filesystem/database, accessible only to the local application instance.</w:t>
       </w:r>
     </w:p>
     <w:p>
@@ -2366,10 +3124,10 @@
           <w:bCs/>
         </w:rPr>
         <w:lastRenderedPageBreak/>
-        <w:t xml:space="preserve">FR-2.1:  </w:t>
-      </w:r>
-      <w:r>
-        <w:t>The system shall read the contents of an uploaded PDF document using the PDF processing engine.</w:t>
+        <w:t xml:space="preserve">NFR-7:  </w:t>
+      </w:r>
+      <w:r>
+        <w:t>API keys for AI services shall not be exposed to end users or hard-coded in distributed source/binaries; they shall be supplied via environment configuration or a secured local configuration file excluded from version control.</w:t>
       </w:r>
     </w:p>
     <w:p>
@@ -2378,695 +3136,6 @@
           <w:b/>
           <w:bCs/>
         </w:rPr>
-        <w:t xml:space="preserve">FR-2.2:  </w:t>
-      </w:r>
-      <w:r>
-        <w:t>The system shall extract textual content from the PDF document.</w:t>
-      </w:r>
-    </w:p>
-    <w:p>
-      <w:r>
-        <w:rPr>
-          <w:b/>
-          <w:bCs/>
-        </w:rPr>
-        <w:t xml:space="preserve">FR-2.3:  </w:t>
-      </w:r>
-      <w:r>
-        <w:t>The system shall identify financial information (monetary amounts, dates, line items) within the extracted text where structurally identifiable.</w:t>
-      </w:r>
-    </w:p>
-    <w:p>
-      <w:r>
-        <w:rPr>
-          <w:b/>
-          <w:bCs/>
-        </w:rPr>
-        <w:t xml:space="preserve">FR-2.4:  </w:t>
-      </w:r>
-      <w:r>
-        <w:t>The system shall store the extracted text associated with its source document for later retrieval and analysis.</w:t>
-      </w:r>
-    </w:p>
-    <w:p>
-      <w:pPr>
-        <w:pStyle w:val="Heading2"/>
-        <w:spacing w:before="0" w:after="0"/>
-      </w:pPr>
-    </w:p>
-    <w:p>
-      <w:pPr>
-        <w:pStyle w:val="Heading2"/>
-        <w:spacing w:before="0" w:after="0"/>
-      </w:pPr>
-      <w:r>
-        <w:t>4.3 AI Analysis</w:t>
-      </w:r>
-    </w:p>
-    <w:p>
-      <w:pPr>
-        <w:pStyle w:val="Heading3"/>
-        <w:spacing w:before="0" w:after="0"/>
-      </w:pPr>
-      <w:r>
-        <w:t>4.3.1 Description and Priority</w:t>
-      </w:r>
-    </w:p>
-    <w:p>
-      <w:r>
-        <w:t xml:space="preserve">Uses an external AI service to analyze extracted financial document text and generate summaries, insights, and recommendations. Priority: High </w:t>
-      </w:r>
-      <w:r>
-        <w:t xml:space="preserve">- </w:t>
-      </w:r>
-      <w:r>
-        <w:t>this is the core value proposition of the application.</w:t>
-      </w:r>
-    </w:p>
-    <w:p>
-      <w:pPr>
-        <w:pStyle w:val="Heading3"/>
-        <w:spacing w:before="0" w:after="0"/>
-      </w:pPr>
-    </w:p>
-    <w:p>
-      <w:pPr>
-        <w:pStyle w:val="Heading3"/>
-        <w:spacing w:before="0" w:after="0"/>
-      </w:pPr>
-      <w:r>
-        <w:t>4.3.2 Stimulus/Response Sequences</w:t>
-      </w:r>
-    </w:p>
-    <w:p>
-      <w:pPr>
-        <w:pStyle w:val="ListParagraph"/>
-        <w:numPr>
-          <w:ilvl w:val="0"/>
-          <w:numId w:val="2"/>
-        </w:numPr>
-      </w:pPr>
-      <w:r>
-        <w:t xml:space="preserve">Text extraction completes </w:t>
-      </w:r>
-      <w:r>
-        <w:t xml:space="preserve">- </w:t>
-      </w:r>
-      <w:r>
-        <w:t xml:space="preserve">user initiates analysis </w:t>
-      </w:r>
-      <w:r>
-        <w:t>-</w:t>
-      </w:r>
-      <w:r>
-        <w:t xml:space="preserve"> system submits extracted text to the configured AI service.</w:t>
-      </w:r>
-    </w:p>
-    <w:p>
-      <w:pPr>
-        <w:pStyle w:val="ListParagraph"/>
-        <w:numPr>
-          <w:ilvl w:val="0"/>
-          <w:numId w:val="2"/>
-        </w:numPr>
-      </w:pPr>
-      <w:r>
-        <w:t xml:space="preserve">AI service returns a response </w:t>
-      </w:r>
-      <w:r>
-        <w:t>-</w:t>
-      </w:r>
-      <w:r>
-        <w:t xml:space="preserve"> system parses the summary, insights, and recommendations and displays them to the user.</w:t>
-      </w:r>
-    </w:p>
-    <w:p>
-      <w:pPr>
-        <w:pStyle w:val="ListParagraph"/>
-        <w:numPr>
-          <w:ilvl w:val="0"/>
-          <w:numId w:val="2"/>
-        </w:numPr>
-      </w:pPr>
-      <w:r>
-        <w:t xml:space="preserve">AI service call fails or times out </w:t>
-      </w:r>
-      <w:r>
-        <w:t>-</w:t>
-      </w:r>
-      <w:r>
-        <w:t xml:space="preserve"> system displays an error and allows the user to retry (see NFR-3).</w:t>
-      </w:r>
-    </w:p>
-    <w:p>
-      <w:pPr>
-        <w:pStyle w:val="Heading3"/>
-        <w:spacing w:before="0" w:after="0"/>
-      </w:pPr>
-    </w:p>
-    <w:p>
-      <w:pPr>
-        <w:pStyle w:val="Heading3"/>
-        <w:spacing w:before="0" w:after="0"/>
-      </w:pPr>
-      <w:r>
-        <w:t>4.3.3 Functional Requirements</w:t>
-      </w:r>
-    </w:p>
-    <w:p>
-      <w:r>
-        <w:rPr>
-          <w:b/>
-          <w:bCs/>
-        </w:rPr>
-        <w:t xml:space="preserve">FR-3.1:  </w:t>
-      </w:r>
-      <w:r>
-        <w:t>The system shall submit extracted document text to a configured AI service (OpenAI API or Google Gemini API) for analysis.</w:t>
-      </w:r>
-    </w:p>
-    <w:p>
-      <w:r>
-        <w:rPr>
-          <w:b/>
-          <w:bCs/>
-        </w:rPr>
-        <w:t xml:space="preserve">FR-3.2:  </w:t>
-      </w:r>
-      <w:r>
-        <w:t>The system shall generate a natural-language summary of each analyzed document.</w:t>
-      </w:r>
-    </w:p>
-    <w:p>
-      <w:r>
-        <w:rPr>
-          <w:b/>
-          <w:bCs/>
-        </w:rPr>
-        <w:t xml:space="preserve">FR-3.3:  </w:t>
-      </w:r>
-      <w:r>
-        <w:t>The system shall identify and present important financial insights extracted from the AI analysis.</w:t>
-      </w:r>
-    </w:p>
-    <w:p>
-      <w:r>
-        <w:rPr>
-          <w:b/>
-          <w:bCs/>
-        </w:rPr>
-        <w:t xml:space="preserve">FR-3.4:  </w:t>
-      </w:r>
-      <w:r>
-        <w:t>The system shall return AI-generated recommendations associated with the analyzed document.</w:t>
-      </w:r>
-    </w:p>
-    <w:p>
-      <w:r>
-        <w:rPr>
-          <w:b/>
-          <w:bCs/>
-        </w:rPr>
-        <w:t xml:space="preserve">FR-3.5:  </w:t>
-      </w:r>
-      <w:r>
-        <w:t>The system shall display the AI analysis results (summary, insights, recommendations) to the user within the application interface.</w:t>
-      </w:r>
-    </w:p>
-    <w:p>
-      <w:pPr>
-        <w:pStyle w:val="Heading2"/>
-        <w:spacing w:before="0" w:after="0"/>
-      </w:pPr>
-    </w:p>
-    <w:p>
-      <w:pPr>
-        <w:pStyle w:val="Heading2"/>
-        <w:spacing w:before="0" w:after="0"/>
-      </w:pPr>
-      <w:r>
-        <w:t>4.4 Document History</w:t>
-      </w:r>
-    </w:p>
-    <w:p>
-      <w:pPr>
-        <w:pStyle w:val="Heading3"/>
-        <w:spacing w:before="0" w:after="0"/>
-      </w:pPr>
-      <w:r>
-        <w:t>4.4.1 Description and Priority</w:t>
-      </w:r>
-    </w:p>
-    <w:p>
-      <w:r>
-        <w:t xml:space="preserve">Allows users to review previously processed documents and their AI-generated results. Priority: Medium </w:t>
-      </w:r>
-      <w:r>
-        <w:t>-</w:t>
-      </w:r>
-      <w:r>
-        <w:t xml:space="preserve"> important for usability but not required for a minimal end-to-end demo.</w:t>
-      </w:r>
-    </w:p>
-    <w:p>
-      <w:pPr>
-        <w:pStyle w:val="Heading3"/>
-        <w:spacing w:before="0" w:after="0"/>
-      </w:pPr>
-    </w:p>
-    <w:p>
-      <w:pPr>
-        <w:pStyle w:val="Heading3"/>
-        <w:spacing w:before="0" w:after="0"/>
-      </w:pPr>
-      <w:r>
-        <w:t>4.4.2 Stimulus/Response Sequences</w:t>
-      </w:r>
-    </w:p>
-    <w:p>
-      <w:pPr>
-        <w:pStyle w:val="ListParagraph"/>
-        <w:numPr>
-          <w:ilvl w:val="0"/>
-          <w:numId w:val="2"/>
-        </w:numPr>
-      </w:pPr>
-      <w:r>
-        <w:t xml:space="preserve">AI analysis completes </w:t>
-      </w:r>
-      <w:r>
-        <w:t xml:space="preserve">- </w:t>
-      </w:r>
-      <w:r>
-        <w:t>system stores document metadata and results in the local database</w:t>
-      </w:r>
-    </w:p>
-    <w:p>
-      <w:pPr>
-        <w:pStyle w:val="ListParagraph"/>
-        <w:numPr>
-          <w:ilvl w:val="0"/>
-          <w:numId w:val="2"/>
-        </w:numPr>
-      </w:pPr>
-      <w:r>
-        <w:t xml:space="preserve">User opens the History screen </w:t>
-      </w:r>
-      <w:r>
-        <w:t>-</w:t>
-      </w:r>
-      <w:r>
-        <w:t xml:space="preserve"> system displays a list of previously processed documents.</w:t>
-      </w:r>
-    </w:p>
-    <w:p>
-      <w:pPr>
-        <w:pStyle w:val="ListParagraph"/>
-        <w:numPr>
-          <w:ilvl w:val="0"/>
-          <w:numId w:val="2"/>
-        </w:numPr>
-      </w:pPr>
-      <w:r>
-        <w:t xml:space="preserve">User enters a search term </w:t>
-      </w:r>
-      <w:r>
-        <w:t>-</w:t>
-      </w:r>
-      <w:r>
-        <w:t xml:space="preserve"> system filters the document list to matching results.</w:t>
-      </w:r>
-    </w:p>
-    <w:p>
-      <w:pPr>
-        <w:pStyle w:val="Heading3"/>
-        <w:spacing w:before="0" w:after="0"/>
-      </w:pPr>
-    </w:p>
-    <w:p>
-      <w:pPr>
-        <w:pStyle w:val="Heading3"/>
-        <w:spacing w:before="0" w:after="0"/>
-      </w:pPr>
-      <w:r>
-        <w:t>4.4.3 Functional Requirements</w:t>
-      </w:r>
-    </w:p>
-    <w:p>
-      <w:r>
-        <w:rPr>
-          <w:b/>
-          <w:bCs/>
-        </w:rPr>
-        <w:t xml:space="preserve">FR-4.1:  </w:t>
-      </w:r>
-      <w:r>
-        <w:t>The system shall store metadata (</w:t>
-      </w:r>
-      <w:r>
-        <w:t>file</w:t>
-      </w:r>
-      <w:r>
-        <w:t xml:space="preserve"> name, upload date) for each processed document.</w:t>
-      </w:r>
-    </w:p>
-    <w:p>
-      <w:r>
-        <w:rPr>
-          <w:b/>
-          <w:bCs/>
-        </w:rPr>
-        <w:t xml:space="preserve">FR-4.2:  </w:t>
-      </w:r>
-      <w:r>
-        <w:t>The system shall save AI-generated results associated with each processed document.</w:t>
-      </w:r>
-    </w:p>
-    <w:p>
-      <w:r>
-        <w:rPr>
-          <w:b/>
-          <w:bCs/>
-        </w:rPr>
-        <w:lastRenderedPageBreak/>
-        <w:t xml:space="preserve">FR-4.3:  </w:t>
-      </w:r>
-      <w:r>
-        <w:t>The system shall allow users to view previously generated analyses from the Document History screen.</w:t>
-      </w:r>
-    </w:p>
-    <w:p>
-      <w:r>
-        <w:rPr>
-          <w:b/>
-          <w:bCs/>
-        </w:rPr>
-        <w:t xml:space="preserve">FR-4.4:  </w:t>
-      </w:r>
-      <w:r>
-        <w:t>The system shall support keyword-based search over stored document history.</w:t>
-      </w:r>
-    </w:p>
-    <w:p>
-      <w:pPr>
-        <w:pStyle w:val="Heading2"/>
-        <w:spacing w:before="0" w:after="0"/>
-      </w:pPr>
-    </w:p>
-    <w:p>
-      <w:pPr>
-        <w:pStyle w:val="Heading2"/>
-        <w:spacing w:before="0" w:after="0"/>
-      </w:pPr>
-      <w:r>
-        <w:t>4.5 Dashboard</w:t>
-      </w:r>
-    </w:p>
-    <w:p>
-      <w:pPr>
-        <w:pStyle w:val="Heading3"/>
-        <w:spacing w:before="0" w:after="0"/>
-      </w:pPr>
-      <w:r>
-        <w:t>4.5.1 Description and Priority</w:t>
-      </w:r>
-    </w:p>
-    <w:p>
-      <w:r>
-        <w:t xml:space="preserve">Provides a consolidated view of uploaded documents, summary statistics, and AI analysis results. Priority: Medium </w:t>
-      </w:r>
-      <w:r>
-        <w:t>-</w:t>
-      </w:r>
-      <w:r>
-        <w:t xml:space="preserve"> enhances usability and supports the project’s reporting goals.</w:t>
-      </w:r>
-    </w:p>
-    <w:p>
-      <w:pPr>
-        <w:pStyle w:val="Heading3"/>
-        <w:spacing w:before="0" w:after="0"/>
-      </w:pPr>
-    </w:p>
-    <w:p>
-      <w:pPr>
-        <w:pStyle w:val="Heading3"/>
-        <w:spacing w:before="0" w:after="0"/>
-      </w:pPr>
-      <w:r>
-        <w:t>4.5.2 Stimulus/Response Sequences</w:t>
-      </w:r>
-    </w:p>
-    <w:p>
-      <w:pPr>
-        <w:pStyle w:val="ListParagraph"/>
-        <w:numPr>
-          <w:ilvl w:val="0"/>
-          <w:numId w:val="2"/>
-        </w:numPr>
-      </w:pPr>
-      <w:r>
-        <w:t xml:space="preserve">User navigates to the Dashboard </w:t>
-      </w:r>
-      <w:r>
-        <w:t>-</w:t>
-      </w:r>
-      <w:r>
-        <w:t xml:space="preserve"> system displays uploaded documents and summary statistics.</w:t>
-      </w:r>
-    </w:p>
-    <w:p>
-      <w:pPr>
-        <w:pStyle w:val="ListParagraph"/>
-        <w:numPr>
-          <w:ilvl w:val="0"/>
-          <w:numId w:val="2"/>
-        </w:numPr>
-      </w:pPr>
-      <w:r>
-        <w:t xml:space="preserve">User selects a document from the dashboard </w:t>
-      </w:r>
-      <w:r>
-        <w:t>-</w:t>
-      </w:r>
-      <w:r>
-        <w:t xml:space="preserve"> system navigates to that document’s detailed AI analysis results.</w:t>
-      </w:r>
-    </w:p>
-    <w:p>
-      <w:pPr>
-        <w:pStyle w:val="Heading3"/>
-        <w:spacing w:before="0" w:after="0"/>
-      </w:pPr>
-    </w:p>
-    <w:p>
-      <w:pPr>
-        <w:pStyle w:val="Heading3"/>
-        <w:spacing w:before="0" w:after="0"/>
-      </w:pPr>
-      <w:r>
-        <w:t>4.5.3 Functional Requirements</w:t>
-      </w:r>
-    </w:p>
-    <w:p>
-      <w:r>
-        <w:rPr>
-          <w:b/>
-          <w:bCs/>
-        </w:rPr>
-        <w:t xml:space="preserve">FR-5.1:  </w:t>
-      </w:r>
-      <w:r>
-        <w:t>The system shall display a list of uploaded documents on the dashboard.</w:t>
-      </w:r>
-    </w:p>
-    <w:p>
-      <w:r>
-        <w:rPr>
-          <w:b/>
-          <w:bCs/>
-        </w:rPr>
-        <w:t xml:space="preserve">FR-5.2:  </w:t>
-      </w:r>
-      <w:r>
-        <w:t>The system shall display summary statistics (total documents processed) on the dashboard.</w:t>
-      </w:r>
-    </w:p>
-    <w:p>
-      <w:r>
-        <w:rPr>
-          <w:b/>
-          <w:bCs/>
-        </w:rPr>
-        <w:t xml:space="preserve">FR-5.3:  </w:t>
-      </w:r>
-      <w:r>
-        <w:t>The system shall display AI analysis results associated with selected documents on the dashboard.</w:t>
-      </w:r>
-    </w:p>
-    <w:p>
-      <w:r>
-        <w:rPr>
-          <w:b/>
-          <w:bCs/>
-        </w:rPr>
-        <w:t xml:space="preserve">FR-5.4:  </w:t>
-      </w:r>
-      <w:r>
-        <w:t>The system shall provide navigation controls allowing the user to move between the dashboard, upload, and history screens.</w:t>
-      </w:r>
-    </w:p>
-    <w:p/>
-    <w:p>
-      <w:pPr>
-        <w:pStyle w:val="Heading1"/>
-        <w:spacing w:before="0" w:after="0"/>
-      </w:pPr>
-      <w:r>
-        <w:t>5. Other Nonfunctional Requirements</w:t>
-      </w:r>
-    </w:p>
-    <w:p>
-      <w:pPr>
-        <w:pStyle w:val="Heading2"/>
-        <w:spacing w:before="0" w:after="0"/>
-      </w:pPr>
-      <w:r>
-        <w:t>5.1 Performance Requirements</w:t>
-      </w:r>
-    </w:p>
-    <w:p>
-      <w:r>
-        <w:rPr>
-          <w:b/>
-          <w:bCs/>
-        </w:rPr>
-        <w:t xml:space="preserve">NFR-1:  </w:t>
-      </w:r>
-      <w:r>
-        <w:t>The system shall process a single uploaded document (extraction plus AI analysis) within 30 seconds under normal conditions and typical AI service response times.</w:t>
-      </w:r>
-    </w:p>
-    <w:p>
-      <w:r>
-        <w:rPr>
-          <w:b/>
-          <w:bCs/>
-        </w:rPr>
-        <w:t xml:space="preserve">NFR-2:  </w:t>
-      </w:r>
-      <w:r>
-        <w:t>The system shall support multiple document uploads without requiring an application restart between uploads.</w:t>
-      </w:r>
-    </w:p>
-    <w:p>
-      <w:pPr>
-        <w:pStyle w:val="Heading2"/>
-        <w:spacing w:before="0" w:after="0"/>
-      </w:pPr>
-    </w:p>
-    <w:p>
-      <w:pPr>
-        <w:pStyle w:val="Heading2"/>
-        <w:spacing w:before="0" w:after="0"/>
-      </w:pPr>
-      <w:r>
-        <w:t>5.2 Safety Requirements</w:t>
-      </w:r>
-    </w:p>
-    <w:p>
-      <w:r>
-        <w:t>The application does not control physical hardware and presents no direct physical safety hazard. The primary “safety” concern for this product is preventing loss or corruption of financial data and avoiding actions that financially mislead the user.</w:t>
-      </w:r>
-    </w:p>
-    <w:p>
-      <w:r>
-        <w:rPr>
-          <w:b/>
-          <w:bCs/>
-        </w:rPr>
-        <w:t xml:space="preserve">NFR-3:  </w:t>
-      </w:r>
-      <w:r>
-        <w:t>The system shall recover gracefully from processing errors (</w:t>
-      </w:r>
-      <w:r>
-        <w:t>(</w:t>
-      </w:r>
-      <w:r>
-        <w:t>failed extraction or failed AI request) without crashing or losing previously saved data.</w:t>
-      </w:r>
-    </w:p>
-    <w:p>
-      <w:r>
-        <w:rPr>
-          <w:b/>
-          <w:bCs/>
-        </w:rPr>
-        <w:t xml:space="preserve">NFR-4:  </w:t>
-      </w:r>
-      <w:r>
-        <w:t>The system shall prevent data corruption of stored documents, metadata, and AI results, including during interrupted operations (application closed mid-save).</w:t>
-      </w:r>
-    </w:p>
-    <w:p>
-      <w:r>
-        <w:rPr>
-          <w:b/>
-          <w:bCs/>
-        </w:rPr>
-        <w:t xml:space="preserve">NFR-5*:  </w:t>
-      </w:r>
-      <w:r>
-        <w:t>The system shall present AI-generated recommendations as informational only and shall not represent them as certified financial, tax, or legal advice.</w:t>
-      </w:r>
-    </w:p>
-    <w:p>
-      <w:pPr>
-        <w:pStyle w:val="Heading2"/>
-        <w:spacing w:before="0" w:after="0"/>
-      </w:pPr>
-    </w:p>
-    <w:p>
-      <w:pPr>
-        <w:pStyle w:val="Heading2"/>
-        <w:spacing w:before="0" w:after="0"/>
-      </w:pPr>
-      <w:r>
-        <w:t>5.3 Security Requirements</w:t>
-      </w:r>
-    </w:p>
-    <w:p>
-      <w:r>
-        <w:rPr>
-          <w:b/>
-          <w:bCs/>
-        </w:rPr>
-        <w:t xml:space="preserve">NFR-6:  </w:t>
-      </w:r>
-      <w:r>
-        <w:t>Uploaded documents shall be stored securely on the local filesystem/database, accessible only to the local application instance.</w:t>
-      </w:r>
-    </w:p>
-    <w:p>
-      <w:r>
-        <w:rPr>
-          <w:b/>
-          <w:bCs/>
-        </w:rPr>
-        <w:t xml:space="preserve">NFR-7:  </w:t>
-      </w:r>
-      <w:r>
-        <w:t>API keys for AI services shall not be exposed to end users or hard-coded in distributed source/binaries; they shall be supplied via environment configuration or a secured local configuration file excluded from version control.</w:t>
-      </w:r>
-    </w:p>
-    <w:p>
-      <w:r>
-        <w:rPr>
-          <w:b/>
-          <w:bCs/>
-        </w:rPr>
-        <w:lastRenderedPageBreak/>
         <w:t xml:space="preserve">NFR-8:  </w:t>
       </w:r>
       <w:r>
@@ -3351,6 +3420,7 @@
         </w:numPr>
       </w:pPr>
       <w:r>
+        <w:lastRenderedPageBreak/>
         <w:t xml:space="preserve">Unit Testing </w:t>
       </w:r>
       <w:r>
@@ -3369,7 +3439,6 @@
         </w:numPr>
       </w:pPr>
       <w:r>
-        <w:lastRenderedPageBreak/>
         <w:t xml:space="preserve">Integration Testing </w:t>
       </w:r>
       <w:r>
@@ -3556,12 +3625,6 @@
         <w:gridCol w:w="6860"/>
       </w:tblGrid>
       <w:tr>
-        <w:tblPrEx>
-          <w:tblCellMar>
-            <w:top w:w="0" w:type="dxa"/>
-            <w:bottom w:w="0" w:type="dxa"/>
-          </w:tblCellMar>
-        </w:tblPrEx>
         <w:trPr>
           <w:tblHeader/>
         </w:trPr>
@@ -3625,12 +3688,6 @@
         </w:tc>
       </w:tr>
       <w:tr>
-        <w:tblPrEx>
-          <w:tblCellMar>
-            <w:top w:w="0" w:type="dxa"/>
-            <w:bottom w:w="0" w:type="dxa"/>
-          </w:tblCellMar>
-        </w:tblPrEx>
         <w:tc>
           <w:tcPr>
             <w:tcW w:w="2500" w:type="dxa"/>
@@ -3681,12 +3738,6 @@
         </w:tc>
       </w:tr>
       <w:tr>
-        <w:tblPrEx>
-          <w:tblCellMar>
-            <w:top w:w="0" w:type="dxa"/>
-            <w:bottom w:w="0" w:type="dxa"/>
-          </w:tblCellMar>
-        </w:tblPrEx>
         <w:tc>
           <w:tcPr>
             <w:tcW w:w="2500" w:type="dxa"/>
@@ -3737,12 +3788,6 @@
         </w:tc>
       </w:tr>
       <w:tr>
-        <w:tblPrEx>
-          <w:tblCellMar>
-            <w:top w:w="0" w:type="dxa"/>
-            <w:bottom w:w="0" w:type="dxa"/>
-          </w:tblCellMar>
-        </w:tblPrEx>
         <w:tc>
           <w:tcPr>
             <w:tcW w:w="2500" w:type="dxa"/>
@@ -3793,12 +3838,6 @@
         </w:tc>
       </w:tr>
       <w:tr>
-        <w:tblPrEx>
-          <w:tblCellMar>
-            <w:top w:w="0" w:type="dxa"/>
-            <w:bottom w:w="0" w:type="dxa"/>
-          </w:tblCellMar>
-        </w:tblPrEx>
         <w:tc>
           <w:tcPr>
             <w:tcW w:w="2500" w:type="dxa"/>
@@ -3849,12 +3888,6 @@
         </w:tc>
       </w:tr>
       <w:tr>
-        <w:tblPrEx>
-          <w:tblCellMar>
-            <w:top w:w="0" w:type="dxa"/>
-            <w:bottom w:w="0" w:type="dxa"/>
-          </w:tblCellMar>
-        </w:tblPrEx>
         <w:tc>
           <w:tcPr>
             <w:tcW w:w="2500" w:type="dxa"/>
@@ -3905,12 +3938,6 @@
         </w:tc>
       </w:tr>
       <w:tr>
-        <w:tblPrEx>
-          <w:tblCellMar>
-            <w:top w:w="0" w:type="dxa"/>
-            <w:bottom w:w="0" w:type="dxa"/>
-          </w:tblCellMar>
-        </w:tblPrEx>
         <w:tc>
           <w:tcPr>
             <w:tcW w:w="2500" w:type="dxa"/>
@@ -3961,12 +3988,6 @@
         </w:tc>
       </w:tr>
       <w:tr>
-        <w:tblPrEx>
-          <w:tblCellMar>
-            <w:top w:w="0" w:type="dxa"/>
-            <w:bottom w:w="0" w:type="dxa"/>
-          </w:tblCellMar>
-        </w:tblPrEx>
         <w:tc>
           <w:tcPr>
             <w:tcW w:w="2500" w:type="dxa"/>
@@ -4017,12 +4038,6 @@
         </w:tc>
       </w:tr>
       <w:tr>
-        <w:tblPrEx>
-          <w:tblCellMar>
-            <w:top w:w="0" w:type="dxa"/>
-            <w:bottom w:w="0" w:type="dxa"/>
-          </w:tblCellMar>
-        </w:tblPrEx>
         <w:tc>
           <w:tcPr>
             <w:tcW w:w="2500" w:type="dxa"/>
@@ -4073,12 +4088,6 @@
         </w:tc>
       </w:tr>
       <w:tr>
-        <w:tblPrEx>
-          <w:tblCellMar>
-            <w:top w:w="0" w:type="dxa"/>
-            <w:bottom w:w="0" w:type="dxa"/>
-          </w:tblCellMar>
-        </w:tblPrEx>
         <w:tc>
           <w:tcPr>
             <w:tcW w:w="2500" w:type="dxa"/>
@@ -4217,12 +4226,6 @@
         <w:gridCol w:w="7160"/>
       </w:tblGrid>
       <w:tr>
-        <w:tblPrEx>
-          <w:tblCellMar>
-            <w:top w:w="0" w:type="dxa"/>
-            <w:bottom w:w="0" w:type="dxa"/>
-          </w:tblCellMar>
-        </w:tblPrEx>
         <w:trPr>
           <w:tblHeader/>
         </w:trPr>
@@ -4315,12 +4318,6 @@
         </w:tc>
       </w:tr>
       <w:tr>
-        <w:tblPrEx>
-          <w:tblCellMar>
-            <w:top w:w="0" w:type="dxa"/>
-            <w:bottom w:w="0" w:type="dxa"/>
-          </w:tblCellMar>
-        </w:tblPrEx>
         <w:tc>
           <w:tcPr>
             <w:tcW w:w="500" w:type="dxa"/>
@@ -4403,12 +4400,6 @@
         </w:tc>
       </w:tr>
       <w:tr>
-        <w:tblPrEx>
-          <w:tblCellMar>
-            <w:top w:w="0" w:type="dxa"/>
-            <w:bottom w:w="0" w:type="dxa"/>
-          </w:tblCellMar>
-        </w:tblPrEx>
         <w:tc>
           <w:tcPr>
             <w:tcW w:w="500" w:type="dxa"/>
@@ -4483,12 +4474,6 @@
         </w:tc>
       </w:tr>
       <w:tr>
-        <w:tblPrEx>
-          <w:tblCellMar>
-            <w:top w:w="0" w:type="dxa"/>
-            <w:bottom w:w="0" w:type="dxa"/>
-          </w:tblCellMar>
-        </w:tblPrEx>
         <w:tc>
           <w:tcPr>
             <w:tcW w:w="500" w:type="dxa"/>
@@ -4563,12 +4548,6 @@
         </w:tc>
       </w:tr>
       <w:tr>
-        <w:tblPrEx>
-          <w:tblCellMar>
-            <w:top w:w="0" w:type="dxa"/>
-            <w:bottom w:w="0" w:type="dxa"/>
-          </w:tblCellMar>
-        </w:tblPrEx>
         <w:tc>
           <w:tcPr>
             <w:tcW w:w="500" w:type="dxa"/>
@@ -4643,12 +4622,6 @@
         </w:tc>
       </w:tr>
       <w:tr>
-        <w:tblPrEx>
-          <w:tblCellMar>
-            <w:top w:w="0" w:type="dxa"/>
-            <w:bottom w:w="0" w:type="dxa"/>
-          </w:tblCellMar>
-        </w:tblPrEx>
         <w:tc>
           <w:tcPr>
             <w:tcW w:w="500" w:type="dxa"/>
@@ -4725,8 +4698,8 @@
     </w:tbl>
     <w:p/>
     <w:sectPr>
-      <w:headerReference w:type="default" r:id="rId7"/>
-      <w:footerReference w:type="default" r:id="rId8"/>
+      <w:headerReference w:type="default" r:id="rId11"/>
+      <w:footerReference w:type="default" r:id="rId12"/>
       <w:pgSz w:w="12240" w:h="15840"/>
       <w:pgMar w:top="1440" w:right="1440" w:bottom="1440" w:left="1440" w:header="708" w:footer="708" w:gutter="0"/>
       <w:cols w:space="720"/>
@@ -5605,6 +5578,18 @@
       <w:szCs w:val="20"/>
     </w:rPr>
   </w:style>
+  <w:style w:type="character" w:styleId="UnresolvedMention">
+    <w:name w:val="Unresolved Mention"/>
+    <w:basedOn w:val="DefaultParagraphFont"/>
+    <w:uiPriority w:val="99"/>
+    <w:semiHidden/>
+    <w:unhideWhenUsed/>
+    <w:rsid w:val="009841F0"/>
+    <w:rPr>
+      <w:color w:val="605E5C"/>
+      <w:shd w:val="clear" w:color="auto" w:fill="E1DFDD"/>
+    </w:rPr>
+  </w:style>
 </w:styles>
 </file>
 

</xml_diff>